<commit_message>
Clarify outgoing reconciliation act tracking and keep print rows whole
</commit_message>
<xml_diff>
--- a/tools/candidates/s1-oplata-za-raboty/07-otpravka-i-dokazatelstvo.docx
+++ b/tools/candidates/s1-oplata-za-raboty/07-otpravka-i-dokazatelstvo.docx
@@ -15,7 +15,7 @@
         <w:rPr>
           <w:i/>
         </w:rPr>
-        <w:t>Файл 07. Как направить заказчику уведомление о просрочке (файл 06), претензию (файл 09) и копию иска (файл 10) так, чтобы направление можно было доказать.</w:t>
+        <w:t>Файл 07. Как направить заказчику исходящий акт сверки (файл 04), уведомление о просрочке (файл 06), претензию (файл 09) и копию иска (файл 10) так, чтобы направление можно было доказать.</w:t>
       </w:r>
     </w:p>
     <w:p>
@@ -69,6 +69,10 @@
         <w:gridCol w:w="2268"/>
       </w:tblGrid>
       <w:tr>
+        <w:trPr>
+          <w:cantSplit/>
+          <w:tblHeader/>
+        </w:trPr>
         <w:tc>
           <w:tcPr>
             <w:tcW w:type="dxa" w:w="1814"/>
@@ -147,6 +151,9 @@
         </w:tc>
       </w:tr>
       <w:tr>
+        <w:trPr>
+          <w:cantSplit/>
+        </w:trPr>
         <w:tc>
           <w:tcPr>
             <w:tcW w:type="dxa" w:w="1814"/>
@@ -201,6 +208,9 @@
         </w:tc>
       </w:tr>
       <w:tr>
+        <w:trPr>
+          <w:cantSplit/>
+        </w:trPr>
         <w:tc>
           <w:tcPr>
             <w:tcW w:type="dxa" w:w="1814"/>
@@ -255,6 +265,9 @@
         </w:tc>
       </w:tr>
       <w:tr>
+        <w:trPr>
+          <w:cantSplit/>
+        </w:trPr>
         <w:tc>
           <w:tcPr>
             <w:tcW w:type="dxa" w:w="1814"/>
@@ -309,6 +322,9 @@
         </w:tc>
       </w:tr>
       <w:tr>
+        <w:trPr>
+          <w:cantSplit/>
+        </w:trPr>
         <w:tc>
           <w:tcPr>
             <w:tcW w:type="dxa" w:w="1814"/>
@@ -363,6 +379,9 @@
         </w:tc>
       </w:tr>
       <w:tr>
+        <w:trPr>
+          <w:cantSplit/>
+        </w:trPr>
         <w:tc>
           <w:tcPr>
             <w:tcW w:type="dxa" w:w="1814"/>
@@ -425,6 +444,15 @@
           <w:i w:val="0"/>
         </w:rPr>
         <w:t>Правило: основной способ + дубль. Каждое отправление — строка в файле 04, лист «Реестр передачи»: способ, дата, идентификатор и где хранится доказательство. Для подтверждения направления сохраните реестр и доказательство направления или получения документов.</w:t>
+      </w:r>
+    </w:p>
+    <w:p>
+      <w:r>
+        <w:rPr>
+          <w:b w:val="0"/>
+          <w:i w:val="0"/>
+        </w:rPr>
+        <w:t>Исходящий акт сверки, который вы направляете заказчику на шаге 6 (файл 03), тоже регистрируйте в файле 04, лист «Реестр передачи»: отдельная строка с датой, способом, адресатом и доказательством отправки или получения. Указание ниже о входящих документах относится только к документам, полученным от заказчика.</w:t>
       </w:r>
     </w:p>
     <w:p>

</xml_diff>